<commit_message>
docs: ajustar asignaciones de roles tecnicos
Co-authored-by: Copilot <223556219+Copilot@users.noreply.github.com>
</commit_message>
<xml_diff>
--- a/docs/documentacion_tecnica.docx
+++ b/docs/documentacion_tecnica.docx
@@ -861,21 +861,8 @@
             <w:vAlign w:val="center"/>
           </w:tcPr>
           <w:p>
-            <w:pPr>
-              <w:spacing w:line="360" w:lineRule="auto"/>
-              <w:rPr>
-                <w:rFonts w:ascii="Arial" w:hAnsi="Arial" w:cs="Arial"/>
-                <w:sz w:val="24"/>
-                <w:szCs w:val="24"/>
-              </w:rPr>
-            </w:pPr>
             <w:r>
-              <w:rPr>
-                <w:rFonts w:ascii="Arial" w:hAnsi="Arial" w:cs="Arial"/>
-                <w:sz w:val="24"/>
-                <w:szCs w:val="24"/>
-              </w:rPr>
-              <w:t>Gutiérrez Ponce Sebastián</w:t>
+              <w:t>Gutiérrez Ponce Sebastián; Delgadillo Escartín Eduardo Abraham</w:t>
             </w:r>
           </w:p>
         </w:tc>
@@ -914,21 +901,8 @@
             <w:vAlign w:val="center"/>
           </w:tcPr>
           <w:p>
-            <w:pPr>
-              <w:spacing w:line="360" w:lineRule="auto"/>
-              <w:rPr>
-                <w:rFonts w:ascii="Arial" w:hAnsi="Arial" w:cs="Arial"/>
-                <w:sz w:val="24"/>
-                <w:szCs w:val="24"/>
-              </w:rPr>
-            </w:pPr>
             <w:r>
-              <w:rPr>
-                <w:rFonts w:ascii="Arial" w:hAnsi="Arial" w:cs="Arial"/>
-                <w:sz w:val="24"/>
-                <w:szCs w:val="24"/>
-              </w:rPr>
-              <w:t>Gutiérrez Ponce Sebastián</w:t>
+              <w:t>Gutiérrez Ponce Sebastián; Carmona Orea Lizbeth</w:t>
             </w:r>
           </w:p>
         </w:tc>

</xml_diff>

<commit_message>
docs: completar entrega tecnica multiusuario
Co-authored-by: Copilot <223556219+Copilot@users.noreply.github.com>
</commit_message>
<xml_diff>
--- a/docs/documentacion_tecnica.docx
+++ b/docs/documentacion_tecnica.docx
@@ -22,54 +22,6 @@
           <w:sz w:val="24"/>
           <w:szCs w:val="24"/>
         </w:rPr>
-        <w:drawing>
-          <wp:inline distT="0" distB="0" distL="0" distR="0" wp14:anchorId="185BA659" wp14:editId="2B8B03DA">
-            <wp:extent cx="4569836" cy="1664419"/>
-            <wp:effectExtent l="0" t="0" r="2540" b="0"/>
-            <wp:docPr id="1639771561" name="Imagen 1" descr="Universidad del Valle de México (UVM), campus Mexicali : Centros de ..."/>
-            <wp:cNvGraphicFramePr>
-              <a:graphicFrameLocks xmlns:a="http://schemas.openxmlformats.org/drawingml/2006/main" noChangeAspect="1"/>
-            </wp:cNvGraphicFramePr>
-            <a:graphic xmlns:a="http://schemas.openxmlformats.org/drawingml/2006/main">
-              <a:graphicData uri="http://schemas.openxmlformats.org/drawingml/2006/picture">
-                <pic:pic xmlns:pic="http://schemas.openxmlformats.org/drawingml/2006/picture">
-                  <pic:nvPicPr>
-                    <pic:cNvPr id="0" name="Picture 1" descr="Universidad del Valle de México (UVM), campus Mexicali : Centros de ..."/>
-                    <pic:cNvPicPr>
-                      <a:picLocks noChangeAspect="1" noChangeArrowheads="1"/>
-                    </pic:cNvPicPr>
-                  </pic:nvPicPr>
-                  <pic:blipFill>
-                    <a:blip r:embed="rId8">
-                      <a:extLst>
-                        <a:ext uri="{28A0092B-C50C-407E-A947-70E740481C1C}">
-                          <a14:useLocalDpi xmlns:a14="http://schemas.microsoft.com/office/drawing/2010/main" val="0"/>
-                        </a:ext>
-                      </a:extLst>
-                    </a:blip>
-                    <a:srcRect/>
-                    <a:stretch>
-                      <a:fillRect/>
-                    </a:stretch>
-                  </pic:blipFill>
-                  <pic:spPr bwMode="auto">
-                    <a:xfrm>
-                      <a:off x="0" y="0"/>
-                      <a:ext cx="4572712" cy="1665467"/>
-                    </a:xfrm>
-                    <a:prstGeom prst="rect">
-                      <a:avLst/>
-                    </a:prstGeom>
-                    <a:noFill/>
-                    <a:ln>
-                      <a:noFill/>
-                    </a:ln>
-                  </pic:spPr>
-                </pic:pic>
-              </a:graphicData>
-            </a:graphic>
-          </wp:inline>
-        </w:drawing>
       </w:r>
       <w:r>
         <w:rPr>
@@ -155,7 +107,7 @@
           <w:szCs w:val="24"/>
         </w:rPr>
         <w:br/>
-        <w:t>Versión documental: 1.3</w:t>
+        <w:t>Versión documental: 1.4</w:t>
       </w:r>
       <w:r>
         <w:rPr>
@@ -164,7 +116,7 @@
           <w:szCs w:val="24"/>
         </w:rPr>
         <w:br/>
-        <w:t>Fecha: 22 de octubre de 2026</w:t>
+        <w:t>Fecha: 23 de octubre de 2026</w:t>
       </w:r>
     </w:p>
     <w:tbl>
@@ -326,21 +278,8 @@
             <w:vAlign w:val="center"/>
           </w:tcPr>
           <w:p>
-            <w:pPr>
-              <w:spacing w:after="20" w:line="360" w:lineRule="auto"/>
-              <w:rPr>
-                <w:rFonts w:ascii="Arial" w:hAnsi="Arial" w:cs="Arial"/>
-                <w:sz w:val="24"/>
-                <w:szCs w:val="24"/>
-              </w:rPr>
-            </w:pPr>
             <w:r>
-              <w:rPr>
-                <w:rFonts w:ascii="Arial" w:hAnsi="Arial" w:cs="Arial"/>
-                <w:sz w:val="24"/>
-                <w:szCs w:val="24"/>
-              </w:rPr>
-              <w:t>1.0</w:t>
+              <w:t>1.4</w:t>
             </w:r>
           </w:p>
         </w:tc>
@@ -379,21 +318,8 @@
             <w:vAlign w:val="center"/>
           </w:tcPr>
           <w:p>
-            <w:pPr>
-              <w:spacing w:after="20" w:line="360" w:lineRule="auto"/>
-              <w:rPr>
-                <w:rFonts w:ascii="Arial" w:hAnsi="Arial" w:cs="Arial"/>
-                <w:sz w:val="24"/>
-                <w:szCs w:val="24"/>
-              </w:rPr>
-            </w:pPr>
             <w:r>
-              <w:rPr>
-                <w:rFonts w:ascii="Arial" w:hAnsi="Arial" w:cs="Arial"/>
-                <w:sz w:val="24"/>
-                <w:szCs w:val="24"/>
-              </w:rPr>
-              <w:t>-</w:t>
+              <w:t>23 de octubre de 2026</w:t>
             </w:r>
           </w:p>
         </w:tc>
@@ -589,7 +515,6 @@
           <w:sz w:val="24"/>
           <w:szCs w:val="24"/>
         </w:rPr>
-        <w:lastRenderedPageBreak/>
         <w:t>Equipo y responsabilidades</w:t>
       </w:r>
       <w:bookmarkEnd w:id="0"/>
@@ -954,7 +879,7 @@
           <w:sz w:val="24"/>
           <w:szCs w:val="24"/>
         </w:rPr>
-        <w:t>Este documento reúne la explicación técnica y operativa del sistema. Los comandos de ejecución presuponen Windows PowerShell y la estructura del espacio de trabajo utilizado en la demostración; las rutas se pueden adaptar al clonar el repositorio. El sistema tiene dos rutas alternativas de ingesta: productores C++ que escriben en MySQL mediante una cola y consumidores, o publicaciones MQTT que pasan por Mosquitto y el ingestor de FastAPI. Docker Compose ejecuta solo Mosquitto; MySQL, FastAPI/Uvicorn y el dashboard son componentes separados. «Real» describe las integraciones de software ejecutadas; las lecturas de los simuladores son sintéticas y el proyecto no incluye sensores físicos. WebSocket mantiene abierto el canal entre navegador y FastAPI para enviar snapshots JSON de estado y alertas obtenidos de MySQL aproximadamente cada 2 s; REST carga el estado inicial y el historial, y sirve temporalmente durante una reconexión. WebSocket no recibe MQTT ni persiste lecturas.</w:t>
+        <w:t>Este documento reúne la explicación técnica y operativa del sistema. Los comandos presuponen Windows PowerShell; las rutas se pueden adaptar al clonar el repositorio. Hay dos rutas alternativas de ingesta: productores C++ que escriben en MySQL mediante cola y consumidores, o publicaciones MQTT que pasan por Mosquitto y el ingestor FastAPI. En la demo local, `docker compose up -d mqtt` inicia solo Mosquitto y la API se inicia por separado; para el despliegue multiusuario, Compose también construye FastAPI y Caddy con HTTPS, mientras MySQL permanece externo. La autenticación individual y la protección de rutas están implementadas, pero el sitio aún no es público porque falta configurar servidor y dominio. «Real» describe integraciones de software; las lecturas de simuladores son sintéticas y no hay sensores físicos. WebSocket distribuye snapshots JSON de estado y alertas consultados en MySQL aproximadamente cada 2 s; REST carga el inicio e historial y sirve temporalmente mientras WebSocket reconecta. WebSocket no recibe MQTT ni persiste lecturas.</w:t>
       </w:r>
     </w:p>
     <w:p>
@@ -1002,7 +927,6 @@
           <w:sz w:val="24"/>
           <w:szCs w:val="24"/>
         </w:rPr>
-        <w:fldChar w:fldCharType="begin"/>
       </w:r>
       <w:r>
         <w:rPr>
@@ -1010,7 +934,6 @@
           <w:sz w:val="24"/>
           <w:szCs w:val="24"/>
         </w:rPr>
-        <w:instrText>TOC \o "1-3" \h \z \u</w:instrText>
       </w:r>
       <w:r>
         <w:rPr>
@@ -1018,7 +941,6 @@
           <w:sz w:val="24"/>
           <w:szCs w:val="24"/>
         </w:rPr>
-        <w:fldChar w:fldCharType="separate"/>
       </w:r>
       <w:hyperlink w:anchor="_Toc242944120" w:history="1">
         <w:r>
@@ -6417,7 +6339,6 @@
           <w:sz w:val="24"/>
           <w:szCs w:val="24"/>
         </w:rPr>
-        <w:fldChar w:fldCharType="end"/>
       </w:r>
     </w:p>
     <w:p>
@@ -6456,7 +6377,7 @@
           <w:sz w:val="24"/>
           <w:szCs w:val="24"/>
         </w:rPr>
-        <w:t>Monitoreo Ambiental en Tiempo Real es un prototipo académico que demuestra ingestión concurrente de lecturas, clasificación por umbrales puntuales, almacenamiento relacional en MySQL y consulta/visualización mediante FastAPI y un dashboard web. Integra dos caminos de entrada: un núcleo C++17 con productores y consumidores concurrentes, y una ruta MQTT opcional implementada en FastAPI.</w:t>
+        <w:t>Monitoreo Ambiental en Tiempo Real es un prototipo académico que demuestra ingestión concurrente, clasificación por umbrales puntuales, almacenamiento en MySQL y consulta/visualización mediante FastAPI y un dashboard web. Integra dos rutas alternativas: un núcleo C++17 con productores y consumidores concurrentes, y una ruta MQTT opcional en FastAPI. El dashboard puede atender varios navegadores; el acceso por Internet requiere además autenticación individual, HTTPS y despliegue en un servidor.</w:t>
       </w:r>
     </w:p>
     <w:p>
@@ -6474,8 +6395,7 @@
           <w:sz w:val="24"/>
           <w:szCs w:val="24"/>
         </w:rPr>
-        <w:lastRenderedPageBreak/>
-        <w:t>La ejecución MQTT validada localmente conectó el simulador de tres sensores al broker Mosquitto, la API, MySQL y el dashboard WebSocket. Se confirmó además la consulta de lecturas a través de /estado-clima. Esto valida el flujo técnico con datos sintéticos; no certifica la precisión ambiental ni acredita el uso de sensores físicos.</w:t>
+        <w:t>La ejecución MQTT validada localmente conectó el simulador de tres sensores al broker Mosquitto, la API, MySQL y el dashboard WebSocket. Se confirmó la consulta por /estado-clima. Las nuevas pruebas validan login individual, protección REST/WebSocket y configuración de producción. El Compose y Caddy se validaron localmente, pero no hay despliegue en Internet: faltan servidor, DNS de un dominio y conectividad de puertos 80/443. Los datos son sintéticos; esto no certifica precisión ambiental ni acredita sensores físicos.</w:t>
       </w:r>
     </w:p>
     <w:tbl>
@@ -6925,6 +6845,50 @@
           </w:p>
         </w:tc>
       </w:tr>
+      <w:tr>
+        <w:tc>
+          <w:tcPr>
+            <w:tcW w:type="dxa" w:w="4997"/>
+          </w:tcPr>
+          <w:p>
+            <w:r>
+              <w:t>Autenticación multiusuario</w:t>
+            </w:r>
+          </w:p>
+        </w:tc>
+        <w:tc>
+          <w:tcPr>
+            <w:tcW w:type="dxa" w:w="4997"/>
+          </w:tcPr>
+          <w:p>
+            <w:r>
+              <w:t>Implementada y probada: cuentas individuales, sesiones, logout, expiración, protección REST/WebSocket y límite de intentos.</w:t>
+            </w:r>
+          </w:p>
+        </w:tc>
+      </w:tr>
+      <w:tr>
+        <w:tc>
+          <w:tcPr>
+            <w:tcW w:type="dxa" w:w="4997"/>
+          </w:tcPr>
+          <w:p>
+            <w:r>
+              <w:t>Despliegue público</w:t>
+            </w:r>
+          </w:p>
+        </w:tc>
+        <w:tc>
+          <w:tcPr>
+            <w:tcW w:type="dxa" w:w="4997"/>
+          </w:tcPr>
+          <w:p>
+            <w:r>
+              <w:t>Compose, imagen API y configuración Caddy validados localmente; aún no desplegado: faltan servidor público y dominio/DNS.</w:t>
+            </w:r>
+          </w:p>
+        </w:tc>
+      </w:tr>
     </w:tbl>
     <w:p>
       <w:pPr>
@@ -7071,7 +7035,6 @@
           <w:sz w:val="24"/>
           <w:szCs w:val="24"/>
         </w:rPr>
-        <w:lastRenderedPageBreak/>
         <w:t>Validar, normalizar y persistir una lectura y, si aplica, una alerta puntual en transacción MySQL.</w:t>
       </w:r>
     </w:p>
@@ -7527,7 +7490,6 @@
                 <w:sz w:val="24"/>
                 <w:szCs w:val="24"/>
               </w:rPr>
-              <w:lastRenderedPageBreak/>
               <w:t>database/schema.sql</w:t>
             </w:r>
           </w:p>
@@ -8000,7 +7962,7 @@
           <w:sz w:val="24"/>
           <w:szCs w:val="24"/>
         </w:rPr>
-        <w:t>Ambas rutas escriben en el mismo esquema MySQL, pero son independientes: el productor C++ no publica MQTT y el consumidor C++ no emite directamente WebSocket. FastAPI consulta la base; el hub WebSocket distribuye snapshots a clientes conectados aproximadamente cada dos segundos.</w:t>
+        <w:t>Ambas rutas escriben en el mismo esquema MySQL, pero son independientes: C++ no publica MQTT ni emite WebSocket. FastAPI consulta la base; el hub distribuye snapshots compartidos a los navegadores conectados a esa instancia aproximadamente cada dos segundos. La visualización simultánea de clientes no significa por sí misma acceso desde Internet: para ello se necesita servidor, dominio, login individual y HTTPS.</w:t>
       </w:r>
     </w:p>
     <w:p>
@@ -8040,7 +8002,7 @@
           <w:sz w:val="24"/>
           <w:szCs w:val="24"/>
         </w:rPr>
-        <w:t>Docker Compose inicia Mosquitto con puerto 1883 enlazado a 127.0.0.1.</w:t>
+        <w:t>En la demo local, Docker Compose inicia Mosquitto con puerto 1883 enlazado a 127.0.0.1. El Compose también define un despliegue diferente con FastAPI y Caddy para acceso multiusuario HTTPS; MySQL permanece externo.</w:t>
       </w:r>
     </w:p>
     <w:p>
@@ -8116,7 +8078,6 @@
           <w:sz w:val="24"/>
           <w:szCs w:val="24"/>
         </w:rPr>
-        <w:lastRenderedPageBreak/>
         <w:t>La API registra sensor si es nuevo, inserta lectura y alerta puntual opcional y ejecuta COMMIT.</w:t>
       </w:r>
     </w:p>
@@ -8155,7 +8116,7 @@
           <w:sz w:val="24"/>
           <w:szCs w:val="24"/>
         </w:rPr>
-        <w:t>REST y el hub consultan MySQL y actualizan el dashboard por WebSocket.</w:t>
+        <w:t>REST carga estado e historial; el hub WebSocket consulta MySQL y comparte actualizaciones con los clientes. Con autenticación habilitada, las rutas de datos y el WebSocket requieren sesión válida.</w:t>
       </w:r>
     </w:p>
     <w:p>
@@ -8429,7 +8390,6 @@
           <w:sz w:val="24"/>
           <w:szCs w:val="24"/>
         </w:rPr>
-        <w:lastRenderedPageBreak/>
         <w:t>5.4 Ejecución y pruebas</w:t>
       </w:r>
       <w:bookmarkEnd w:id="16"/>
@@ -9192,7 +9152,6 @@
                 <w:sz w:val="24"/>
                 <w:szCs w:val="24"/>
               </w:rPr>
-              <w:lastRenderedPageBreak/>
               <w:t>crítico 75 (provisional); promedio_24h crítico 25 (fase Año 5)</w:t>
             </w:r>
           </w:p>
@@ -9217,7 +9176,6 @@
                 <w:sz w:val="24"/>
                 <w:szCs w:val="24"/>
               </w:rPr>
-              <w:lastRenderedPageBreak/>
               <w:t xml:space="preserve">NOM-025 Tabla 1: </w:t>
             </w:r>
             <w:r>
@@ -9226,7 +9184,6 @@
                 <w:sz w:val="24"/>
                 <w:szCs w:val="24"/>
               </w:rPr>
-              <w:lastRenderedPageBreak/>
               <w:t>41/33/25 µg/m³ por fases Año 1/3/5. Fase Año 5 al 14-oct-2026; sin umbral instantáneo.</w:t>
             </w:r>
           </w:p>
@@ -9257,7 +9214,6 @@
                 <w:sz w:val="24"/>
                 <w:szCs w:val="24"/>
               </w:rPr>
-              <w:lastRenderedPageBreak/>
               <w:t>CO</w:t>
             </w:r>
             <w:r>
@@ -9511,7 +9467,6 @@
           <w:sz w:val="24"/>
           <w:szCs w:val="24"/>
         </w:rPr>
-        <w:lastRenderedPageBreak/>
         <w:t>6.2 Integridad y carga</w:t>
       </w:r>
       <w:bookmarkEnd w:id="19"/>
@@ -10222,6 +10177,134 @@
           </w:p>
         </w:tc>
       </w:tr>
+      <w:tr>
+        <w:tc>
+          <w:tcPr>
+            <w:tcW w:type="dxa" w:w="3331"/>
+          </w:tcPr>
+          <w:p>
+            <w:r>
+              <w:t>GET /login</w:t>
+            </w:r>
+          </w:p>
+        </w:tc>
+        <w:tc>
+          <w:tcPr>
+            <w:tcW w:type="dxa" w:w="3331"/>
+          </w:tcPr>
+          <w:p>
+            <w:r>
+              <w:t>Pantalla de inicio de sesión cuando la autenticación está habilitada.</w:t>
+            </w:r>
+          </w:p>
+        </w:tc>
+        <w:tc>
+          <w:tcPr>
+            <w:tcW w:type="dxa" w:w="3331"/>
+          </w:tcPr>
+          <w:p>
+            <w:r>
+              <w:t>HTML; redirección al dashboard si está deshabilitada.</w:t>
+            </w:r>
+          </w:p>
+        </w:tc>
+      </w:tr>
+      <w:tr>
+        <w:tc>
+          <w:tcPr>
+            <w:tcW w:type="dxa" w:w="3331"/>
+          </w:tcPr>
+          <w:p>
+            <w:r>
+              <w:t>POST /auth/login</w:t>
+            </w:r>
+          </w:p>
+        </w:tc>
+        <w:tc>
+          <w:tcPr>
+            <w:tcW w:type="dxa" w:w="3331"/>
+          </w:tcPr>
+          <w:p>
+            <w:r>
+              <w:t>Verifica credenciales y crea sesión firmada; limita intentos por IP.</w:t>
+            </w:r>
+          </w:p>
+        </w:tc>
+        <w:tc>
+          <w:tcPr>
+            <w:tcW w:type="dxa" w:w="3331"/>
+          </w:tcPr>
+          <w:p>
+            <w:r>
+              <w:t>200; 401 credenciales inválidas; 429 límite excedido.</w:t>
+            </w:r>
+          </w:p>
+        </w:tc>
+      </w:tr>
+      <w:tr>
+        <w:tc>
+          <w:tcPr>
+            <w:tcW w:type="dxa" w:w="3331"/>
+          </w:tcPr>
+          <w:p>
+            <w:r>
+              <w:t>POST /auth/logout</w:t>
+            </w:r>
+          </w:p>
+        </w:tc>
+        <w:tc>
+          <w:tcPr>
+            <w:tcW w:type="dxa" w:w="3331"/>
+          </w:tcPr>
+          <w:p>
+            <w:r>
+              <w:t>Limpia la sesión.</w:t>
+            </w:r>
+          </w:p>
+        </w:tc>
+        <w:tc>
+          <w:tcPr>
+            <w:tcW w:type="dxa" w:w="3331"/>
+          </w:tcPr>
+          <w:p>
+            <w:r>
+              <w:t>204 sin contenido.</w:t>
+            </w:r>
+          </w:p>
+        </w:tc>
+      </w:tr>
+      <w:tr>
+        <w:tc>
+          <w:tcPr>
+            <w:tcW w:type="dxa" w:w="3331"/>
+          </w:tcPr>
+          <w:p>
+            <w:r>
+              <w:t>GET /healthz</w:t>
+            </w:r>
+          </w:p>
+        </w:tc>
+        <w:tc>
+          <w:tcPr>
+            <w:tcW w:type="dxa" w:w="3331"/>
+          </w:tcPr>
+          <w:p>
+            <w:r>
+              <w:t>Chequeo básico para el healthcheck del contenedor.</w:t>
+            </w:r>
+          </w:p>
+        </w:tc>
+        <w:tc>
+          <w:tcPr>
+            <w:tcW w:type="dxa" w:w="3331"/>
+          </w:tcPr>
+          <w:p>
+            <w:r>
+              <w:t>JSON genérico; no valida MySQL.</w:t>
+            </w:r>
+          </w:p>
+        </w:tc>
+      </w:tr>
     </w:tbl>
     <w:p>
       <w:pPr>
@@ -10269,7 +10352,7 @@
           <w:sz w:val="24"/>
           <w:szCs w:val="24"/>
         </w:rPr>
-        <w:t>Fallos de conexión MySQL en consultas responden HTTP 503. /salud puede indicar estado degradado. La disponibilidad del socket no demuestra por sí sola la disponibilidad de base o recepción de sensores: comprobar API, MySQL y MQTT por separado.</w:t>
+        <w:t>Los fallos MySQL en consultas responden HTTP 503 y /salud puede indicar estado degradado. En modo autenticado, REST requiere sesión y devuelve 401 si falta; el dashboard redirige a /login. WebSocket exige sesión válida y origen del mismo host. /healthz es un chequeo básico del contenedor, no valida MySQL. Comprobar API, MySQL y MQTT por separado.</w:t>
       </w:r>
     </w:p>
     <w:p>
@@ -10289,7 +10372,6 @@
           <w:sz w:val="24"/>
           <w:szCs w:val="24"/>
         </w:rPr>
-        <w:lastRenderedPageBreak/>
         <w:t>8. Ingesta MQTT</w:t>
       </w:r>
       <w:bookmarkEnd w:id="23"/>
@@ -10908,7 +10990,7 @@
           <w:sz w:val="24"/>
           <w:szCs w:val="24"/>
         </w:rPr>
-        <w:t>La persistencia precede al ACK. En error SQL se revierte y no se confirma el mensaje, para permitir reentrega; la clave única evita insertar dos veces la misma lectura. El estado del ingestor expone guardadas, duplicadas, errores y último error. Compose usa eclipse-mosquitto:2, acceso anónimo local y persistencia desactivada; no es configuración de producción. mosquitto.docker.conf es el archivo montado por Compose; mosquitto.conf es alternativa no montada.</w:t>
+        <w:t>La persistencia precede al ACK. En error SQL se revierte y no se confirma el mensaje para permitir reentrega; la clave ?nica controla duplicados. El estado del ingestor expone guardadas, duplicadas, errores y ?ltimo error. El Mosquitto incluido permite acceso anónimo y está enlazado a localhost para desarrollo; no es configuración de producción. `mosquitto.docker.conf` es el archivo montado por Compose; `mosquitto.conf` es una alternativa no montada.</w:t>
       </w:r>
     </w:p>
     <w:p>
@@ -10928,7 +11010,6 @@
           <w:sz w:val="24"/>
           <w:szCs w:val="24"/>
         </w:rPr>
-        <w:lastRenderedPageBreak/>
         <w:t>8.3 Simulador MQTT</w:t>
       </w:r>
       <w:bookmarkEnd w:id="26"/>
@@ -11003,7 +11084,7 @@
           <w:sz w:val="24"/>
           <w:szCs w:val="24"/>
         </w:rPr>
-        <w:t>El frontend es HTML/CSS/JavaScript sin framework ni paso de compilación. FastAPI lo sirve en /dashboard/; Uvicorn es el servidor que ejecuta FastAPI. En carga inicial usa REST y después conecta /ws/dashboard, un canal persistente que recibe snapshots JSON de estado y alertas aproximadamente cada 2 s. El navegador envía ping y recibe pong como latido. Si WebSocket se desconecta, consulta REST temporalmente mientras reconecta. La tabla horaria presenta promedios separados de PM2.5 y temperatura en UTC; la clasificación corresponde solo a PM2.5. Las alertas guardadas se generan por lecturas puntuales; «activas» significa no atendidas y el historial incluye atendidas y no atendidas. El panel muestra hasta 20 alertas activas o 100 recientes en el historial, con desplazamiento interno.</w:t>
+        <w:t>El frontend es HTML/CSS/JavaScript sin framework ni compilación. FastAPI lo sirve en /dashboard/; Uvicorn ejecuta FastAPI. La carga inicial usa REST y después conecta /ws/dashboard, que recibe snapshots JSON cada 2 s. El navegador envía ping y recibe pong; al desconectarse WebSocket, consulta REST mientras reconecta. La tabla horaria presenta promedios separados de PM2.5 y temperatura en UTC; la clasificación corresponde solo a PM2.5. «Activas» significa alertas puntuales no atendidas. El panel muestra hasta 20 alertas activas o 100 recientes. Con autenticación habilitada, se inicia sesión con cuenta individual, se puede cerrar sesión y al expirar se redirige al login; el modo local predeterminado no solicita credenciales.</w:t>
       </w:r>
     </w:p>
     <w:p>
@@ -11178,7 +11259,7 @@
           <w:sz w:val="24"/>
           <w:szCs w:val="24"/>
         </w:rPr>
-        <w:t>Docker Desktop en ejecución y WSL/Virtual Machine Platform para broker MQTT Compose.</w:t>
+        <w:t>Docker Desktop/Compose es opcional para ejecutar localmente la API; se necesita para Mosquitto en la ruta MQTT. Para despliegue público se requiere Docker Engine/Compose en un servidor Linux y Caddy para HTTPS. MySQL es externo al Compose.</w:t>
       </w:r>
     </w:p>
     <w:p>
@@ -11479,7 +11560,6 @@
                 <w:sz w:val="24"/>
                 <w:szCs w:val="24"/>
               </w:rPr>
-              <w:lastRenderedPageBreak/>
               <w:t>recomendado; root es valor técnico predeterminado.</w:t>
             </w:r>
           </w:p>
@@ -11509,7 +11589,6 @@
                 <w:sz w:val="24"/>
                 <w:szCs w:val="24"/>
               </w:rPr>
-              <w:lastRenderedPageBreak/>
               <w:t>MYSQL_PASSWORD</w:t>
             </w:r>
           </w:p>
@@ -12191,6 +12270,230 @@
           </w:p>
         </w:tc>
       </w:tr>
+      <w:tr>
+        <w:tc>
+          <w:tcPr>
+            <w:tcW w:type="dxa" w:w="3857"/>
+          </w:tcPr>
+          <w:p>
+            <w:r>
+              <w:t>APP_ENV</w:t>
+            </w:r>
+          </w:p>
+        </w:tc>
+        <w:tc>
+          <w:tcPr>
+            <w:tcW w:type="dxa" w:w="3087"/>
+          </w:tcPr>
+          <w:p>
+            <w:r>
+              <w:t>Activa validaciones de producción.</w:t>
+            </w:r>
+          </w:p>
+        </w:tc>
+        <w:tc>
+          <w:tcPr>
+            <w:tcW w:type="dxa" w:w="3266"/>
+          </w:tcPr>
+          <w:p>
+            <w:r>
+              <w:t>production exige autenticación.</w:t>
+            </w:r>
+          </w:p>
+        </w:tc>
+      </w:tr>
+      <w:tr>
+        <w:tc>
+          <w:tcPr>
+            <w:tcW w:type="dxa" w:w="3857"/>
+          </w:tcPr>
+          <w:p>
+            <w:r>
+              <w:t>DASHBOARD_AUTH_ENABLED</w:t>
+            </w:r>
+          </w:p>
+        </w:tc>
+        <w:tc>
+          <w:tcPr>
+            <w:tcW w:type="dxa" w:w="3087"/>
+          </w:tcPr>
+          <w:p>
+            <w:r>
+              <w:t>Habilita login y protege REST/WebSocket.</w:t>
+            </w:r>
+          </w:p>
+        </w:tc>
+        <w:tc>
+          <w:tcPr>
+            <w:tcW w:type="dxa" w:w="3266"/>
+          </w:tcPr>
+          <w:p>
+            <w:r>
+              <w:t>false local; true en Compose de producción.</w:t>
+            </w:r>
+          </w:p>
+        </w:tc>
+      </w:tr>
+      <w:tr>
+        <w:tc>
+          <w:tcPr>
+            <w:tcW w:type="dxa" w:w="3857"/>
+          </w:tcPr>
+          <w:p>
+            <w:r>
+              <w:t>DASHBOARD_SESSION_SECRET</w:t>
+            </w:r>
+          </w:p>
+        </w:tc>
+        <w:tc>
+          <w:tcPr>
+            <w:tcW w:type="dxa" w:w="3087"/>
+          </w:tcPr>
+          <w:p>
+            <w:r>
+              <w:t>Firma la sesión.</w:t>
+            </w:r>
+          </w:p>
+        </w:tc>
+        <w:tc>
+          <w:tcPr>
+            <w:tcW w:type="dxa" w:w="3266"/>
+          </w:tcPr>
+          <w:p>
+            <w:r>
+              <w:t>Aleatorio, mínimo 32 bytes; obligatorio con autenticación.</w:t>
+            </w:r>
+          </w:p>
+        </w:tc>
+      </w:tr>
+      <w:tr>
+        <w:tc>
+          <w:tcPr>
+            <w:tcW w:type="dxa" w:w="3857"/>
+          </w:tcPr>
+          <w:p>
+            <w:r>
+              <w:t>DASHBOARD_USERS</w:t>
+            </w:r>
+          </w:p>
+        </w:tc>
+        <w:tc>
+          <w:tcPr>
+            <w:tcW w:type="dxa" w:w="3087"/>
+          </w:tcPr>
+          <w:p>
+            <w:r>
+              <w:t>Cuentas individuales usuario:hash.</w:t>
+            </w:r>
+          </w:p>
+        </w:tc>
+        <w:tc>
+          <w:tcPr>
+            <w:tcW w:type="dxa" w:w="3266"/>
+          </w:tcPr>
+          <w:p>
+            <w:r>
+              <w:t>Entradas separadas por ;, generadas con create_user_hash.py.</w:t>
+            </w:r>
+          </w:p>
+        </w:tc>
+      </w:tr>
+      <w:tr>
+        <w:tc>
+          <w:tcPr>
+            <w:tcW w:type="dxa" w:w="3857"/>
+          </w:tcPr>
+          <w:p>
+            <w:r>
+              <w:t>DASHBOARD_COOKIE_SECURE</w:t>
+            </w:r>
+          </w:p>
+        </w:tc>
+        <w:tc>
+          <w:tcPr>
+            <w:tcW w:type="dxa" w:w="3087"/>
+          </w:tcPr>
+          <w:p>
+            <w:r>
+              <w:t>Restringe cookie a HTTPS.</w:t>
+            </w:r>
+          </w:p>
+        </w:tc>
+        <w:tc>
+          <w:tcPr>
+            <w:tcW w:type="dxa" w:w="3266"/>
+          </w:tcPr>
+          <w:p>
+            <w:r>
+              <w:t>true obligatorio en producción.</w:t>
+            </w:r>
+          </w:p>
+        </w:tc>
+      </w:tr>
+      <w:tr>
+        <w:tc>
+          <w:tcPr>
+            <w:tcW w:type="dxa" w:w="3857"/>
+          </w:tcPr>
+          <w:p>
+            <w:r>
+              <w:t>DASHBOARD_SESSION_MAX_AGE</w:t>
+            </w:r>
+          </w:p>
+        </w:tc>
+        <w:tc>
+          <w:tcPr>
+            <w:tcW w:type="dxa" w:w="3087"/>
+          </w:tcPr>
+          <w:p>
+            <w:r>
+              <w:t>Duración de sesión en segundos.</w:t>
+            </w:r>
+          </w:p>
+        </w:tc>
+        <w:tc>
+          <w:tcPr>
+            <w:tcW w:type="dxa" w:w="3266"/>
+          </w:tcPr>
+          <w:p>
+            <w:r>
+              <w:t>28800 (8 h) predeterminado; rango 300–86400.</w:t>
+            </w:r>
+          </w:p>
+        </w:tc>
+      </w:tr>
+      <w:tr>
+        <w:tc>
+          <w:tcPr>
+            <w:tcW w:type="dxa" w:w="3857"/>
+          </w:tcPr>
+          <w:p>
+            <w:r>
+              <w:t>ALLOWED_HOSTS / DASHBOARD_DOMAIN</w:t>
+            </w:r>
+          </w:p>
+        </w:tc>
+        <w:tc>
+          <w:tcPr>
+            <w:tcW w:type="dxa" w:w="3087"/>
+          </w:tcPr>
+          <w:p>
+            <w:r>
+              <w:t>Limita host y configura Caddy.</w:t>
+            </w:r>
+          </w:p>
+        </w:tc>
+        <w:tc>
+          <w:tcPr>
+            <w:tcW w:type="dxa" w:w="3266"/>
+          </w:tcPr>
+          <w:p>
+            <w:r>
+              <w:t>Dominio con DNS a servidor; TCP 80/443 accesibles.</w:t>
+            </w:r>
+          </w:p>
+        </w:tc>
+      </w:tr>
     </w:tbl>
     <w:p>
       <w:pPr>
@@ -12238,7 +12541,7 @@
           <w:sz w:val="24"/>
           <w:szCs w:val="24"/>
         </w:rPr>
-        <w:t>Abre PowerShell en la carpeta raíz del repositorio; no necesitas VS Code. La demostración usa el puerto 8000. La contraseña se solicita sin eco, pero MYSQL_PASSWORD permanece en el entorno del proceso mientras viva la terminal.</w:t>
+        <w:t>Abre PowerShell en la raíz del repositorio; no necesitas VS Code. La contraseña se solicita sin eco, pero MYSQL_PASSWORD permanece en el entorno del proceso mientras viva la terminal. Configura las variables e inicia Uvicorn desde esa misma terminal: PowerShell no las comparte con otras ventanas. La segunda terminal se usa para el simulador.</w:t>
       </w:r>
     </w:p>
     <w:p>
@@ -12369,7 +12672,7 @@
           <w:szCs w:val="24"/>
         </w:rPr>
         <w:br/>
-        <w:t>..\..\.venv\Scripts\python.exe -m uvicorn app.main:app --host 127.0.0.1 --port 8010</w:t>
+        <w:t>..\..\.venv\Scripts\python.exe -m uvicorn app.main:app --host 127.0.0.1 --port 8000</w:t>
       </w:r>
     </w:p>
     <w:p>
@@ -12387,8 +12690,7 @@
           <w:sz w:val="24"/>
           <w:szCs w:val="24"/>
         </w:rPr>
-        <w:lastRenderedPageBreak/>
-        <w:t>Deja abierta la terminal de Uvicorn. Tras reiniciar Windows, variables de entorno y procesos no persisten: repite configuración e inicia Docker/API. Si el puerto está ocupado, identifica la instancia anterior y deténla de forma controlada o selecciona otro puerto.</w:t>
+        <w:t>Deja abierta la terminal de Uvicorn. Tras reiniciar Windows, variables y procesos no persisten: repite configuración e inicia Docker/API. Si Uvicorn está en otra terminal sin MYSQL_PASSWORD, pulsa Ctrl+C y reinícialo desde la ventana donde definiste las variables. Si el puerto está ocupado, identifica la instancia previa o selecciona otro puerto.</w:t>
       </w:r>
     </w:p>
     <w:p>
@@ -12498,7 +12800,7 @@
           <w:sz w:val="24"/>
           <w:szCs w:val="24"/>
         </w:rPr>
-        <w:t>Usar cuenta MySQL de aplicación; reservar administrador para crear esquema y asignar privilegios. La aplicación actual requiere SELECT e INSERT sobre el esquema.</w:t>
+        <w:t>Usar una cuenta MySQL separada; reservar root/administrador para crear el esquema y asignar privilegios. La aplicación requiere SELECT e INSERT; no necesita DELETE para la operación normal.</w:t>
       </w:r>
     </w:p>
     <w:p>
@@ -12517,7 +12819,7 @@
           <w:sz w:val="24"/>
           <w:szCs w:val="24"/>
         </w:rPr>
-        <w:t>No pegar contraseñas en chat, capturas, código o commits. Read-Host oculta el tecleo; variable de entorno sigue existiendo en el proceso.</w:t>
+        <w:t>No pegar contraseñas en chat, capturas, código, documentos entregables ni commits. Read-Host oculta el tecleo, pero la variable permanece en el entorno de la terminal y sus procesos; usar un gestor de secretos en servidor.</w:t>
       </w:r>
     </w:p>
     <w:p>
@@ -12536,7 +12838,7 @@
           <w:sz w:val="24"/>
           <w:szCs w:val="24"/>
         </w:rPr>
-        <w:t>El broker anónimo solo está enlazado a localhost; no exponer en LAN/Internet.</w:t>
+        <w:t>El Mosquitto incluido permite acceso anónimo y solo está enlazado a localhost en desarrollo. No publicarlo en LAN/Internet. El despliegue web público usa Caddy y no expone directamente el puerto 8000 de FastAPI.</w:t>
       </w:r>
     </w:p>
     <w:p>
@@ -12555,7 +12857,7 @@
           <w:sz w:val="24"/>
           <w:szCs w:val="24"/>
         </w:rPr>
-        <w:t>Para dispositivos o broker remoto: autenticación, TLS, firewall y gestión segura de credenciales.</w:t>
+        <w:t>La autenticación individual del dashboard está implementada: PBKDF2-SHA256 con 600 000 iteraciones, sesiones firmadas con expiración (8 h predeterminadas), cookies HttpOnly/SameSite=Strict y Secure obligatorio en producción, control de origen WebSocket y límite de 10 intentos de login por IP cada 60 s por proceso. El sitio aún requiere servidor y dominio para ser público. Un broker remoto para dispositivos es independiente y debe contar con autenticación, TLS y firewall; el broker de desarrollo no es apto para ello.</w:t>
       </w:r>
     </w:p>
     <w:p>
@@ -12574,7 +12876,7 @@
           <w:sz w:val="24"/>
           <w:szCs w:val="24"/>
         </w:rPr>
-        <w:t>Antes de producción: permisos mínimos, backup, política de retención, observabilidad y recuperación.</w:t>
+        <w:t>Antes de operar en producción: generar secreto de sesión aleatorio de al menos 32 bytes, configurar cuentas individuales, proteger .env, restringir firewall y MySQL a la IP del servidor, establecer backups, retención, observabilidad y recuperación. Revisar controles adicionales de infraestructura.</w:t>
       </w:r>
     </w:p>
     <w:p>
@@ -12778,21 +13080,8 @@
             <w:vAlign w:val="center"/>
           </w:tcPr>
           <w:p>
-            <w:pPr>
-              <w:spacing w:after="20" w:line="360" w:lineRule="auto"/>
-              <w:rPr>
-                <w:rFonts w:ascii="Arial" w:hAnsi="Arial" w:cs="Arial"/>
-                <w:sz w:val="24"/>
-                <w:szCs w:val="24"/>
-              </w:rPr>
-            </w:pPr>
             <w:r>
-              <w:rPr>
-                <w:rFonts w:ascii="Arial" w:hAnsi="Arial" w:cs="Arial"/>
-                <w:sz w:val="24"/>
-                <w:szCs w:val="24"/>
-              </w:rPr>
-              <w:t>API/MQTT/WebSocket (13 tests)</w:t>
+              <w:t>API, MQTT, WebSocket y autenticación (23 pruebas)</w:t>
             </w:r>
           </w:p>
         </w:tc>
@@ -12802,30 +13091,8 @@
             <w:vAlign w:val="center"/>
           </w:tcPr>
           <w:p>
-            <w:pPr>
-              <w:spacing w:after="20" w:line="360" w:lineRule="auto"/>
-              <w:rPr>
-                <w:rFonts w:ascii="Arial" w:hAnsi="Arial" w:cs="Arial"/>
-                <w:sz w:val="24"/>
-                <w:szCs w:val="24"/>
-              </w:rPr>
-            </w:pPr>
             <w:r>
-              <w:rPr>
-                <w:rFonts w:ascii="Arial" w:hAnsi="Arial" w:cs="Arial"/>
-                <w:sz w:val="24"/>
-                <w:szCs w:val="24"/>
-              </w:rPr>
-              <w:t xml:space="preserve">Pasaron en ejecución con Mosquitto local; se reportó warning deprecación </w:t>
-            </w:r>
-            <w:r>
-              <w:rPr>
-                <w:rFonts w:ascii="Arial" w:hAnsi="Arial" w:cs="Arial"/>
-                <w:sz w:val="24"/>
-                <w:szCs w:val="24"/>
-              </w:rPr>
-              <w:lastRenderedPageBreak/>
-              <w:t>Starlette/httpx.</w:t>
+              <w:t>22 pasaron; 1 de broker real omitida sin MQTT_TEST_BROKER. Warning Starlette/httpx no bloqueante.</w:t>
             </w:r>
           </w:p>
         </w:tc>
@@ -12835,31 +13102,8 @@
             <w:vAlign w:val="center"/>
           </w:tcPr>
           <w:p>
-            <w:pPr>
-              <w:spacing w:after="20" w:line="360" w:lineRule="auto"/>
-              <w:rPr>
-                <w:rFonts w:ascii="Arial" w:hAnsi="Arial" w:cs="Arial"/>
-                <w:sz w:val="24"/>
-                <w:szCs w:val="24"/>
-              </w:rPr>
-            </w:pPr>
             <w:r>
-              <w:rPr>
-                <w:rFonts w:ascii="Arial" w:hAnsi="Arial" w:cs="Arial"/>
-                <w:sz w:val="24"/>
-                <w:szCs w:val="24"/>
-              </w:rPr>
-              <w:lastRenderedPageBreak/>
-              <w:t xml:space="preserve">Test broker usa mock para DB; tests separados cubren validación, transacción, </w:t>
-            </w:r>
-            <w:r>
-              <w:rPr>
-                <w:rFonts w:ascii="Arial" w:hAnsi="Arial" w:cs="Arial"/>
-                <w:sz w:val="24"/>
-                <w:szCs w:val="24"/>
-              </w:rPr>
-              <w:lastRenderedPageBreak/>
-              <w:t>ACK, WebSocket, salud e historial.</w:t>
+              <w:t>Incluye hash/login/logout, expiración, limitador, REST, WebSocket y origen, producción, MQTT, umbrales y difusión.</w:t>
             </w:r>
           </w:p>
         </w:tc>
@@ -12889,7 +13133,6 @@
                 <w:sz w:val="24"/>
                 <w:szCs w:val="24"/>
               </w:rPr>
-              <w:lastRenderedPageBreak/>
               <w:t>Configuración carga SQL (1 test)</w:t>
             </w:r>
           </w:p>
@@ -13033,20 +13276,7 @@
             <w:vAlign w:val="center"/>
           </w:tcPr>
           <w:p>
-            <w:pPr>
-              <w:spacing w:after="20" w:line="360" w:lineRule="auto"/>
-              <w:rPr>
-                <w:rFonts w:ascii="Arial" w:hAnsi="Arial" w:cs="Arial"/>
-                <w:sz w:val="24"/>
-                <w:szCs w:val="24"/>
-              </w:rPr>
-            </w:pPr>
             <w:r>
-              <w:rPr>
-                <w:rFonts w:ascii="Arial" w:hAnsi="Arial" w:cs="Arial"/>
-                <w:sz w:val="24"/>
-                <w:szCs w:val="24"/>
-              </w:rPr>
               <w:t>Demo manual MQTT</w:t>
             </w:r>
           </w:p>
@@ -13058,20 +13288,7 @@
             <w:vAlign w:val="center"/>
           </w:tcPr>
           <w:p>
-            <w:pPr>
-              <w:spacing w:after="20" w:line="360" w:lineRule="auto"/>
-              <w:rPr>
-                <w:rFonts w:ascii="Arial" w:hAnsi="Arial" w:cs="Arial"/>
-                <w:sz w:val="24"/>
-                <w:szCs w:val="24"/>
-              </w:rPr>
-            </w:pPr>
             <w:r>
-              <w:rPr>
-                <w:rFonts w:ascii="Arial" w:hAnsi="Arial" w:cs="Arial"/>
-                <w:sz w:val="24"/>
-                <w:szCs w:val="24"/>
-              </w:rPr>
               <w:t>Confirmada por usuario, 13-oct-2026.</w:t>
             </w:r>
           </w:p>
@@ -13083,20 +13300,7 @@
             <w:vAlign w:val="center"/>
           </w:tcPr>
           <w:p>
-            <w:pPr>
-              <w:spacing w:after="20" w:line="360" w:lineRule="auto"/>
-              <w:rPr>
-                <w:rFonts w:ascii="Arial" w:hAnsi="Arial" w:cs="Arial"/>
-                <w:sz w:val="24"/>
-                <w:szCs w:val="24"/>
-              </w:rPr>
-            </w:pPr>
             <w:r>
-              <w:rPr>
-                <w:rFonts w:ascii="Arial" w:hAnsi="Arial" w:cs="Arial"/>
-                <w:sz w:val="24"/>
-                <w:szCs w:val="24"/>
-              </w:rPr>
               <w:t>Tres sensores sintéticos, MySQL, /estado-clima y dashboard WebSocket.</w:t>
             </w:r>
           </w:p>
@@ -13259,6 +13463,38 @@
           </w:p>
         </w:tc>
       </w:tr>
+      <w:tr>
+        <w:tc>
+          <w:tcPr>
+            <w:tcW w:type="dxa" w:w="3331"/>
+          </w:tcPr>
+          <w:p>
+            <w:r>
+              <w:t>Despliegue multiusuario</w:t>
+            </w:r>
+          </w:p>
+        </w:tc>
+        <w:tc>
+          <w:tcPr>
+            <w:tcW w:type="dxa" w:w="3331"/>
+          </w:tcPr>
+          <w:p>
+            <w:r>
+              <w:t>Imagen API construida; Compose y Caddy validados localmente.</w:t>
+            </w:r>
+          </w:p>
+        </w:tc>
+        <w:tc>
+          <w:tcPr>
+            <w:tcW w:type="dxa" w:w="3331"/>
+          </w:tcPr>
+          <w:p>
+            <w:r>
+              <w:t>Sin VPS/DNS configurados, no hay URL pública ni validación externa.</w:t>
+            </w:r>
+          </w:p>
+        </w:tc>
+      </w:tr>
     </w:tbl>
     <w:p>
       <w:pPr>
@@ -13285,7 +13521,7 @@
           <w:sz w:val="24"/>
           <w:szCs w:val="24"/>
         </w:rPr>
-        <w:t>El endpoint local dejó de responder tras reinicios en una revisión posterior. La demo se registra como evidencia histórica confirmada por el usuario; no se afirma que el servicio siga ejecutándose actualmente.</w:t>
+        <w:t>La demo local es evidencia histórica confirmada por el usuario; no se afirma que el servicio siga ejecutándose. La preparación multiusuario se incorporó después: pruebas automatizadas, construcción Docker y validación Caddy pasaron localmente, pero no hay despliegue público confirmado porque todavía no se dispone de servidor ni dominio.</w:t>
       </w:r>
     </w:p>
     <w:p>
@@ -13355,7 +13591,6 @@
           <w:sz w:val="24"/>
           <w:szCs w:val="24"/>
         </w:rPr>
-        <w:lastRenderedPageBreak/>
         <w:t>..\..\.venv\Scripts\python.exe -m unittest discover -s tests -p "test_*.py" -v</w:t>
       </w:r>
       <w:r>
@@ -14073,6 +14308,70 @@
           </w:p>
         </w:tc>
       </w:tr>
+      <w:tr>
+        <w:tc>
+          <w:tcPr>
+            <w:tcW w:type="dxa" w:w="3331"/>
+          </w:tcPr>
+          <w:p>
+            <w:r>
+              <w:t>Falta MYSQL_PASSWORD / 401 en REST</w:t>
+            </w:r>
+          </w:p>
+        </w:tc>
+        <w:tc>
+          <w:tcPr>
+            <w:tcW w:type="dxa" w:w="3331"/>
+          </w:tcPr>
+          <w:p>
+            <w:r>
+              <w:t>Uvicorn se inició en otra terminal o no tiene la variable.</w:t>
+            </w:r>
+          </w:p>
+        </w:tc>
+        <w:tc>
+          <w:tcPr>
+            <w:tcW w:type="dxa" w:w="3331"/>
+          </w:tcPr>
+          <w:p>
+            <w:r>
+              <w:t>Define MYSQL_* en la terminal de la API; si ya corre en otra, Ctrl+C y reinícialo ahí. PowerShell no comparte variables entre ventanas.</w:t>
+            </w:r>
+          </w:p>
+        </w:tc>
+      </w:tr>
+      <w:tr>
+        <w:tc>
+          <w:tcPr>
+            <w:tcW w:type="dxa" w:w="3331"/>
+          </w:tcPr>
+          <w:p>
+            <w:r>
+              <w:t>Acceso desde otro equipo no funciona</w:t>
+            </w:r>
+          </w:p>
+        </w:tc>
+        <w:tc>
+          <w:tcPr>
+            <w:tcW w:type="dxa" w:w="3331"/>
+          </w:tcPr>
+          <w:p>
+            <w:r>
+              <w:t>Modo local enlazado a 127.0.0.1 o falta servidor/DNS/firewall.</w:t>
+            </w:r>
+          </w:p>
+        </w:tc>
+        <w:tc>
+          <w:tcPr>
+            <w:tcW w:type="dxa" w:w="3331"/>
+          </w:tcPr>
+          <w:p>
+            <w:r>
+              <w:t>El acceso público requiere Compose, dominio apuntado al VPS y TCP 80/443. No se habilita solo al subir el código a GitHub.</w:t>
+            </w:r>
+          </w:p>
+        </w:tc>
+      </w:tr>
     </w:tbl>
     <w:p>
       <w:pPr>
@@ -14101,7 +14400,6 @@
           <w:sz w:val="24"/>
           <w:szCs w:val="24"/>
         </w:rPr>
-        <w:lastRenderedPageBreak/>
         <w:t>14. Pendientes y evolución recomendada</w:t>
       </w:r>
       <w:bookmarkEnd w:id="38"/>
@@ -14179,7 +14477,7 @@
           <w:sz w:val="24"/>
           <w:szCs w:val="24"/>
         </w:rPr>
-        <w:t>Diseñar autenticación/TLS y retención antes de exponer broker fuera de localhost.</w:t>
+        <w:t>Configurar servidor, DNS del dominio, firewall y MySQL accesible desde la IP del servidor antes del despliegue público. El Compose incorpora login individual y Caddy/HTTPS; aún no se ha publicado la aplicación. Mantener MQTT anónimo restringido a localhost o usar broker remoto autenticado con TLS.</w:t>
       </w:r>
     </w:p>
     <w:p>
@@ -14762,6 +15060,94 @@
           </w:p>
         </w:tc>
       </w:tr>
+      <w:tr>
+        <w:tc>
+          <w:tcPr>
+            <w:tcW w:type="dxa" w:w="4997"/>
+          </w:tcPr>
+          <w:p>
+            <w:r>
+              <w:t>Autenticación multiusuario</w:t>
+            </w:r>
+          </w:p>
+        </w:tc>
+        <w:tc>
+          <w:tcPr>
+            <w:tcW w:type="dxa" w:w="4997"/>
+          </w:tcPr>
+          <w:p>
+            <w:r>
+              <w:t>Control con cuentas individuales habilitado por DASHBOARD_AUTH_ENABLED.</w:t>
+            </w:r>
+          </w:p>
+        </w:tc>
+      </w:tr>
+      <w:tr>
+        <w:tc>
+          <w:tcPr>
+            <w:tcW w:type="dxa" w:w="4997"/>
+          </w:tcPr>
+          <w:p>
+            <w:r>
+              <w:t>Sesión firmada</w:t>
+            </w:r>
+          </w:p>
+        </w:tc>
+        <w:tc>
+          <w:tcPr>
+            <w:tcW w:type="dxa" w:w="4997"/>
+          </w:tcPr>
+          <w:p>
+            <w:r>
+              <w:t>Cookie cuya integridad valida el servidor y que expira según DASHBOARD_SESSION_MAX_AGE.</w:t>
+            </w:r>
+          </w:p>
+        </w:tc>
+      </w:tr>
+      <w:tr>
+        <w:tc>
+          <w:tcPr>
+            <w:tcW w:type="dxa" w:w="4997"/>
+          </w:tcPr>
+          <w:p>
+            <w:r>
+              <w:t>Caddy</w:t>
+            </w:r>
+          </w:p>
+        </w:tc>
+        <w:tc>
+          <w:tcPr>
+            <w:tcW w:type="dxa" w:w="4997"/>
+          </w:tcPr>
+          <w:p>
+            <w:r>
+              <w:t>Proxy inverso que termina HTTPS y obtiene/renueva certificados TLS automáticamente.</w:t>
+            </w:r>
+          </w:p>
+        </w:tc>
+      </w:tr>
+      <w:tr>
+        <w:tc>
+          <w:tcPr>
+            <w:tcW w:type="dxa" w:w="4997"/>
+          </w:tcPr>
+          <w:p>
+            <w:r>
+              <w:t>VPS / dominio</w:t>
+            </w:r>
+          </w:p>
+        </w:tc>
+        <w:tc>
+          <w:tcPr>
+            <w:tcW w:type="dxa" w:w="4997"/>
+          </w:tcPr>
+          <w:p>
+            <w:r>
+              <w:t>Servidor público y nombre DNS necesarios para una URL accesible por Internet.</w:t>
+            </w:r>
+          </w:p>
+        </w:tc>
+      </w:tr>
     </w:tbl>
     <w:p>
       <w:pPr>
@@ -14791,7 +15177,6 @@
           <w:sz w:val="24"/>
           <w:szCs w:val="24"/>
         </w:rPr>
-        <w:lastRenderedPageBreak/>
         <w:t>16. Manual técnico de despliegue y operación</w:t>
       </w:r>
       <w:bookmarkEnd w:id="40"/>
@@ -14811,7 +15196,7 @@
           <w:sz w:val="24"/>
           <w:szCs w:val="24"/>
         </w:rPr>
-        <w:t>Guía de trabajo para instalar, configurar, iniciar, verificar, probar y detener el prototipo en Windows. Está dirigida a desarrolladores y responsables técnicos. Los comandos usan PowerShell, salvo donde se indique MSYS2 UCRT64. Las lecturas generadas durante la demostración son sintéticas; este procedimiento no convierte el prototipo en un sistema certificado ni configura sensores físicos.</w:t>
+        <w:t>Guía para operar el prototipo local en Windows y para el despliegue multiusuario preparado para servidor Linux. Está dirigida a desarrolladores y responsables técnicos. Las lecturas son sintéticas; no se instalan sensores físicos ni se certifican mediciones.</w:t>
       </w:r>
     </w:p>
     <w:p>
@@ -14850,7 +15235,7 @@
           <w:sz w:val="24"/>
           <w:szCs w:val="24"/>
         </w:rPr>
-        <w:t>El servicio se compone de MySQL (almacén persistente), FastAPI (API REST, ingesta MQTT opcional y WebSocket), Uvicorn (servidor que ejecuta FastAPI) y un dashboard estático servido por la API. Para la ruta MQTT local, Docker Compose inicia el contenedor eclipse-mosquitto:2, que transporta mensajes en el puerto 1883; no ejecuta MySQL, FastAPI ni el dashboard. La ruta C++ es alternativa: productores, cola concurrente y consumidores escriben directamente en la misma base sin pasar por MQTT ni FastAPI. Para ver datos nuevos debe ejecutarse al menos un productor; iniciar solo la API no genera lecturas. WebSocket mantiene abierto un canal de salida FastAPI→navegador: el hub comparte una consulta MySQL y envía snapshots JSON de estado y alertas aproximadamente cada 2 s. No es el canal de ingesta MQTT ni una capa de persistencia; REST carga el inicio y el historial, y funciona como respaldo temporal mientras WebSocket reconecta.</w:t>
+        <w:t>El sistema incluye MySQL externo, FastAPI (REST, ingesta MQTT opcional y WebSocket), Uvicorn y dashboard estático. En demo local, `docker compose up -d mqtt` inicia solo Mosquitto y la API se inicia por separado. En despliegue multiusuario, `docker compose up -d --build` construye FastAPI y Caddy, que gestiona HTTPS automático; MySQL sigue fuera de Compose. C++ es una ruta alternativa que escribe en la misma base. Para datos nuevos debe ejecutarse un productor; iniciar solo la API no genera lecturas. WebSocket distribuye snapshots a los clientes; no ingiere MQTT ni persiste lecturas. El acceso a Internet requiere servidor, DNS del dominio y puertos 80/443; esos recursos aún no están configurados.</w:t>
       </w:r>
     </w:p>
     <w:p>
@@ -14907,7 +15292,7 @@
           <w:sz w:val="24"/>
           <w:szCs w:val="24"/>
         </w:rPr>
-        <w:t>El broker Compose del repositorio permite acceso anónimo y es únicamente para desarrollo local; no se debe publicar en una red externa.</w:t>
+        <w:t>El Mosquitto incluido en Compose permite acceso anónimo y es solo para desarrollo local; el puerto se enlaza a localhost. No publicarlo en redes externas. Compose no aloja MySQL.</w:t>
       </w:r>
     </w:p>
     <w:p>
@@ -14985,8 +15370,7 @@
           <w:sz w:val="24"/>
           <w:szCs w:val="24"/>
         </w:rPr>
-        <w:lastRenderedPageBreak/>
-        <w:t>Docker Desktop y WSL/Virtual Machine Platform, únicamente para ejecutar el broker MQTT de Compose.</w:t>
+        <w:t>Docker Desktop/Compose en Windows para probar MQTT. Para despliegue público se requiere Docker Engine y Compose v2 en servidor Linux; Caddy necesita puertos TCP 80/443 para obtener y renovar certificados. MySQL debe ser accesible desde el servidor y estar restringido por firewall.</w:t>
       </w:r>
     </w:p>
     <w:p>
@@ -15023,7 +15407,7 @@
           <w:sz w:val="24"/>
           <w:szCs w:val="24"/>
         </w:rPr>
-        <w:t>La guía detallada para principiantes está en docs/manual_usuario.md. No se requiere VS Code ni MySQL Workbench. En los pasos siguientes, abre PowerShell en la raíz del repositorio y adapta la ruta si el proyecto está en otra ubicación.</w:t>
+        <w:t>La guía para principiantes está en docs/manual_usuario.md y la guía multiusuario en src/api_fastapi/README.md. No se requiere VS Code ni MySQL Workbench. Los pasos locales usan PowerShell desde la raíz; adapta las rutas si es necesario.</w:t>
       </w:r>
     </w:p>
     <w:p>
@@ -15129,7 +15513,7 @@
           <w:sz w:val="24"/>
           <w:szCs w:val="24"/>
         </w:rPr>
-        <w:t>Cuando el cliente muestre mysql&gt;, crea la cuenta de aplicación: CREATE USER IF NOT EXISTS 'monitoreo_app'@'127.0.0.1' IDENTIFIED BY 'CAMBIA_ESTA_CLAVE'; GRANT SELECT, INSERT ON monitoreo_ambiental.* TO 'monitoreo_app'@'127.0.0.1'; EXIT;. Cambia la clave de ejemplo por una propia. No la escribas en el repositorio, documentos ni capturas; configura la misma en MYSQL_PASSWORD.</w:t>
+        <w:t>En mysql&gt;, crea la cuenta de aplicación local: CREATE USER IF NOT EXISTS 'monitoreo_app'@'127.0.0.1' IDENTIFIED BY 'CAMBIA_ESTA_CLAVE'; GRANT SELECT, INSERT ON monitoreo_ambiental.* TO 'monitoreo_app'@'127.0.0.1'; EXIT;. Cambia la clave por una propia. No la escribas en repositorio, documentos ni capturas; configura la misma en MYSQL_PASSWORD. En producción, autoriza la conexión desde la IP del servidor y no uses esta identidad local de ejemplo.</w:t>
       </w:r>
     </w:p>
     <w:p>
@@ -15226,7 +15610,7 @@
           <w:sz w:val="24"/>
           <w:szCs w:val="24"/>
         </w:rPr>
-        <w:t>En cada terminal PowerShell que vaya a ejecutar la API o un componente con acceso SQL, configura las variables en esa sesión. Read-Host oculta la entrada durante la captura, pero la contraseña se conserva en el entorno del proceso mientras viva la terminal.</w:t>
+        <w:t>En la terminal PowerShell que ejecutará la API, define las variables de MySQL en esa misma sesión. Read-Host oculta la entrada, pero la contraseña queda en el entorno mientras viva la terminal. No inicies Uvicorn en una ventana distinta esperando que herede las variables; la terminal del simulador no necesita MYSQL_PASSWORD.</w:t>
       </w:r>
     </w:p>
     <w:p>
@@ -15326,7 +15710,6 @@
           <w:sz w:val="24"/>
           <w:szCs w:val="24"/>
         </w:rPr>
-        <w:lastRenderedPageBreak/>
         <w:t>$clave = Read-Host "Contraseña MySQL" -AsSecureString</w:t>
       </w:r>
     </w:p>
@@ -15365,7 +15748,7 @@
           <w:sz w:val="24"/>
           <w:szCs w:val="24"/>
         </w:rPr>
-        <w:t>Los valores por defecto del servicio son host 127.0.0.1 y puerto 3306; configura usuario, contraseña y base de datos explícitamente para evitar utilizar la cuenta técnica predeterminada. Las variables creadas en una terminal no se heredan en otras terminales ya abiertas.</w:t>
+        <w:t>Los valores predeterminados son host 127.0.0.1 y puerto 3306; configura usuario, contraseña y base explícitamente. Las variables no se heredan en otras terminales. Uvicorn debe iniciarse desde la terminal configurada; si ya se inició desde otra, detenlo con Ctrl+C y reinícialo después de definir MYSQL_*.</w:t>
       </w:r>
     </w:p>
     <w:p>
@@ -15404,7 +15787,7 @@
           <w:sz w:val="24"/>
           <w:szCs w:val="24"/>
         </w:rPr>
-        <w:t>1. En la terminal de la API, entra en src\api_fastapi y configura además el broker opcional. Si solo se utilizará la ruta C++, no es necesario habilitar MQTT ni iniciar Docker.</w:t>
+        <w:t>1. En la misma terminal donde configuraste MYSQL_*, entra en src\api_fastapi y configura el broker opcional. Si solo se utilizará C++, no es necesario habilitar MQTT ni iniciar Docker.</w:t>
       </w:r>
     </w:p>
     <w:p>
@@ -15540,7 +15923,7 @@
           <w:sz w:val="24"/>
           <w:szCs w:val="24"/>
         </w:rPr>
-        <w:t>3. Inicia Uvicorn. El puerto 8000 es el predeterminado en la guía del componente; si ya está ocupado, selecciona otro puerto y úsalo en todas las URL siguientes.</w:t>
+        <w:t>3. Inicia Uvicorn desde esta misma terminal, que conserva MYSQL_* y MQTT_* configuradas. El puerto predeterminado es 8000; si está ocupado, selecciona otro y ?salo en todas las URL siguientes.</w:t>
       </w:r>
     </w:p>
     <w:p>
@@ -15578,7 +15961,7 @@
           <w:sz w:val="24"/>
           <w:szCs w:val="24"/>
         </w:rPr>
-        <w:t>4. Mantén esa terminal abierta. En el navegador abre http://127.0.0.1:8000/dashboard/ para el panel y http://127.0.0.1:8000/docs para Swagger UI. La API expone también /salud, /estado-clima, /alertas y /alertas/historial; el dashboard carga inicialmente con REST y recibe actualizaciones mediante /ws/dashboard.</w:t>
+        <w:t>4. Mantén abierta la terminal de Uvicorn. En la demo local sin autenticación abre http://127.0.0.1:8000/dashboard/ y /docs. La API expone /salud, /estado-clima, /alertas, /alertas/historial y /ws/dashboard. El modo local no requiere login por defecto y no da acceso por Internet.</w:t>
       </w:r>
     </w:p>
     <w:p>
@@ -15695,7 +16078,6 @@
           <w:sz w:val="24"/>
           <w:szCs w:val="24"/>
         </w:rPr>
-        <w:lastRenderedPageBreak/>
         <w:t>{</w:t>
       </w:r>
     </w:p>
@@ -16068,7 +16450,6 @@
           <w:sz w:val="24"/>
           <w:szCs w:val="24"/>
         </w:rPr>
-        <w:lastRenderedPageBreak/>
         <w:t>El modo continuo produce lecturas sintéticas y las persiste hasta Ctrl+C. No ejecutes simultáneamente varias instancias con los mismos identificadores/timestamps salvo que estés probando el control de duplicados.</w:t>
       </w:r>
     </w:p>
@@ -16186,7 +16567,7 @@
           <w:sz w:val="24"/>
           <w:szCs w:val="24"/>
         </w:rPr>
-        <w:t>La prueba contra un broker real solo se incluye cuando Mosquitto está activo y se define MQTT_TEST_BROKER = 127.0.0.1; las demás pruebas MQTT pueden simular el broker y la persistencia. Ejecuta las pruebas de configuración de carga desde src\database con:</w:t>
+        <w:t>La suite actual de API tiene 23 pruebas: 22 pasan y 1 prueba con broker real se omite si no se define MQTT_TEST_BROKER o no hay Mosquitto. Incluye autenticación, login/logout, expiración, rate limit, protección REST/WebSocket, validación de producción, MQTT, umbrales y difusión a varios clientes. Se observó un warning de deprecación Starlette/httpx en TestClient; no hizo fallar las pruebas. Ejecuta las pruebas de configuración de carga desde src\database con:</w:t>
       </w:r>
     </w:p>
     <w:p>
@@ -16394,7 +16775,6 @@
           <w:sz w:val="24"/>
           <w:szCs w:val="24"/>
         </w:rPr>
-        <w:lastRenderedPageBreak/>
         <w:t>USE monitoreo_ambiental;</w:t>
       </w:r>
       <w:r>
@@ -16561,7 +16941,7 @@
           <w:sz w:val="24"/>
           <w:szCs w:val="24"/>
         </w:rPr>
-        <w:t>La API no inicia o /salud no conecta: verifica que MySQL esté activo, que el esquema monitoreo_ambiental exista, que las variables MYSQL_* estén definidas en la misma terminal desde la que iniciaste Uvicorn y que los permisos incluyan SELECT e INSERT.</w:t>
+        <w:t>La API no inicia o /salud no conecta: verifica MySQL, el esquema monitoreo_ambiental, MYSQL_* en la misma terminal donde iniciaste Uvicorn y permisos SELECT/INSERT. Si falta MYSQL_PASSWORD y Uvicorn está en otra ventana, detenlo con Ctrl+C y reinícialo desde la terminal configurada.</w:t>
       </w:r>
     </w:p>
     <w:p>
@@ -16635,8 +17015,7 @@
           <w:sz w:val="24"/>
           <w:szCs w:val="24"/>
         </w:rPr>
-        <w:lastRenderedPageBreak/>
-        <w:t>16.12 Condiciones antes de cualquier uso fuera de desarrollo</w:t>
+        <w:t>16.12 Despliegue multiusuario y condiciones fuera de desarrollo</w:t>
       </w:r>
       <w:bookmarkEnd w:id="52"/>
     </w:p>
@@ -16655,7 +17034,25 @@
           <w:sz w:val="24"/>
           <w:szCs w:val="24"/>
         </w:rPr>
-        <w:t>Este manual describe una demostración local. Antes de desplegar el sistema en una red real se requiere, como mínimo, sustituir el broker anónimo por uno autenticado con TLS, restringir puertos mediante firewall, gestionar secretos fuera de archivos y repositorio, revisar permisos de base, establecer respaldo y retención, y validar la instrumentación y los umbrales con especialistas. No conectar hardware ni presentar lecturas como mediciones certificadas sin calibración y verificación independientes.</w:t>
+        <w:t>El despliegue multiusuario está preparado, no publicado. Requiere servidor Linux público con Docker Engine/Compose, dominio cuyo DNS apunte a la IP del servidor y puertos TCP 80/443 abiertos. MySQL debe ser alcanzable desde ese servidor y restringido por firewall a su IP; no se incluye en Compose. En src\api_fastapi copia .env.example a .env (no subirlo a Git), configura DASHBOARD_DOMAIN, MYSQL_HOST/PORT/USER/PASSWORD/DATABASE, genera DASHBOARD_SESSION_SECRET aleatorio de al menos 32 bytes y crea una línea por usuario con create_user_hash.py; separa los pares usuario:hash en DASHBOARD_USERS con punto y coma. El generador exige contraseña de al menos 12 caracteres y guarda solo el hash PBKDF2. Ejecuta `docker compose up -d --build`; Caddy obtiene/renueva HTTPS y FastAPI queda solo en la red interna, detrás de Caddy. Los usuarios entran en https://DASHBOARD_DOMAIN/; el Compose fuerza autenticación, cookie segura y host permitido. Para detener sin borrar certificados/configuración usa `docker compose down`, no `down -v`. No hay URL pública ni prueba externa porque aún no se configuran servidor y dominio. El broker MQTT incluido sigue anónimo y local; no exponerlo a Internet. Antes de operación real, definir backups, retención, monitorización, actualización de dependencias y respuesta a incidentes, y validar sensores/umbrales con especialistas. Las lecturas sintéticas no son mediciones certificadas.</w:t>
+      </w:r>
+    </w:p>
+    <w:p>
+      <w:pPr/>
+      <w:r>
+        <w:t>Preparación de cuentas y secretos en el servidor: desde src/api_fastapi copia `.env.example` a `.env` y restringe sus permisos (por ejemplo, `chmod 600 .env`). Genera DASHBOARD_SESSION_SECRET con `python3 -c "import secrets; print(secrets.token_urlsafe(48))"`. Para cada usuario ejecuta `python3 create_user_hash.py &lt;usuario&gt;`; el generador solicita la contraseña dos veces, exige al menos 12 caracteres y devuelve `usuario:hash`. Une las líneas de cuentas con punto y coma en DASHBOARD_USERS. Sustituye los valores de ejemplo de dominio y MySQL; no subas `.env` a GitHub ni compartas hashes/secretos públicamente.</w:t>
+      </w:r>
+    </w:p>
+    <w:p>
+      <w:pPr/>
+      <w:r>
+        <w:t>Arranque y acceso: con DNS apuntando al servidor, MySQL permitido solo desde la IP de la aplicación y TCP 80/443 abiertos, desde src/api_fastapi ejecuta `docker compose up -d --build`. Caddy obtiene y renueva el certificado; FastAPI queda en la red interna del Compose y Caddy publica el servicio HTTPS. Abre `https://DASHBOARD_DOMAIN/` e inicia sesión con la cuenta configurada. Para detener conserva los volúmenes con `docker compose down` (no usar `down -v`).</w:t>
+      </w:r>
+    </w:p>
+    <w:p>
+      <w:pPr/>
+      <w:r>
+        <w:t>Límites: este despliegue está preparado y validado por construcción/configuración local, pero no está publicado. La operación pública requiere que el equipo configure servidor, DNS, firewall, base remota y secretos reales. El broker MQTT Compose sigue siendo anónimo y local; los dispositivos no deben conectarse a ese broker por Internet. Para MQTT remoto se requiere broker independiente con autenticación/TLS y configuración de red segura.</w:t>
       </w:r>
     </w:p>
     <w:p>

</xml_diff>